<commit_message>
docs: finalize dossier metadata, publication PDF, and research repository URL
</commit_message>
<xml_diff>
--- a/Quantitative_Trading_Portfolio_Blueprint.docx
+++ b/Quantitative_Trading_Portfolio_Blueprint.docx
@@ -18,6 +18,29 @@
           <w:sz w:val="32"/>
         </w:rPr>
         <w:t>Quantitative Trading &amp; Algorithmic Backtesting Portfolio</w:t>
+      </w:r>
+    </w:p>
+    <w:p>
+      <w:pPr>
+        <w:spacing w:before="40" w:after="80" w:line="276" w:lineRule="auto"/>
+      </w:pPr>
+      <w:r>
+        <w:rPr>
+          <w:rFonts w:ascii="Calibri" w:hAnsi="Calibri"/>
+          <w:b/>
+          <w:color w:val="24292E"/>
+          <w:sz w:val="19"/>
+        </w:rPr>
+        <w:t>Version:</w:t>
+      </w:r>
+      <w:r>
+        <w:rPr>
+          <w:rFonts w:ascii="Calibri" w:hAnsi="Calibri"/>
+          <w:b w:val="0"/>
+          <w:color w:val="24292E"/>
+          <w:sz w:val="19"/>
+        </w:rPr>
+        <w:t xml:space="preserve"> October 2026</w:t>
       </w:r>
     </w:p>
     <w:p>
@@ -150,16 +173,7 @@
           <w:color w:val="24292E"/>
           <w:sz w:val="19"/>
         </w:rPr>
-        <w:t xml:space="preserve"> </w:t>
-      </w:r>
-      <w:r>
-        <w:rPr>
-          <w:rFonts w:ascii="Consolas" w:hAnsi="Consolas"/>
-          <w:b w:val="0"/>
-          <w:color w:val="333333"/>
-          <w:sz w:val="17"/>
-        </w:rPr>
-        <w:t>[Insert GitHub Repository URL / Private Research Release Available Upon Request]</w:t>
+        <w:t xml:space="preserve"> [https://github.com/hennaneihab-svg/quant-trading-portfolio](https://github.com/hennaneihab-svg/quant-trading-portfolio)</w:t>
       </w:r>
     </w:p>
     <w:p>
@@ -6165,7 +6179,7 @@
           <w:color w:val="333333"/>
           <w:sz w:val="17"/>
         </w:rPr>
-        <w:t>fa24f532...</w:t>
+        <w:t>fa24f532b9dd6a939f3443037e51af6efd5d78599fe0c10be6a30e8c63a865dc</w:t>
       </w:r>
       <w:r>
         <w:rPr>
@@ -6183,7 +6197,7 @@
           <w:color w:val="333333"/>
           <w:sz w:val="17"/>
         </w:rPr>
-        <w:t>9f3664c3...</w:t>
+        <w:t>9f3664c3651899aad6bba8d565af4a57301b71e279ee2cc280f37deaf6164489</w:t>
       </w:r>
       <w:r>
         <w:rPr>

</xml_diff>